<commit_message>
fix: restore SSD1315 chip name, use "1315驱动 0.96寸 4针 OLED" description
</commit_message>
<xml_diff>
--- a/claude_code/docs/软件架构与开发者指南.docx
+++ b/claude_code/docs/软件架构与开发者指南.docx
@@ -1540,7 +1540,7 @@
           <w:sz w:val="20"/>
           <w:szCs w:val="20"/>
         </w:rPr>
-        <w:t xml:space="preserve">**适用硬件**: STM32F103C8T6 + ESP8266-01 + OLED1315 OLED</w:t>
+        <w:t xml:space="preserve">**适用硬件**: STM32F103C8T6 + ESP8266-01 + SSD1315 OLED</w:t>
       </w:r>
     </w:p>
     <w:p>
@@ -2244,7 +2244,7 @@
                 <w:sz w:val="20"/>
                 <w:szCs w:val="20"/>
               </w:rPr>
-              <w:t xml:space="preserve">OLED1315 128×64 模拟 I2C 驱动 (PA11/PA12)，双页面：控制面板 + 锁屏监控</w:t>
+              <w:t xml:space="preserve">SSD1315 128×64 模拟 I2C 驱动 (PA11/PA12)，双页面：控制面板 + 锁屏监控</w:t>
             </w:r>
           </w:p>
         </w:tc>
@@ -3361,7 +3361,7 @@
           <w:sz w:val="19"/>
           <w:szCs w:val="19"/>
         </w:rPr>
-        <w:t xml:space="preserve">        │ TIM1全桥 │    │ OLED1315  │    │  双通道  │</w:t>
+        <w:t xml:space="preserve">        │ TIM1全桥 │    │ SSD1315  │    │  双通道  │</w:t>
       </w:r>
     </w:p>
     <w:p>
@@ -4583,23 +4583,23 @@
           <w:sz w:val="19"/>
           <w:szCs w:val="19"/>
         </w:rPr>
-        <w:t xml:space="preserve">│   PA11 ─── OLED_SCL ─── OLED1315 SCL (模拟 I2C)          │</w:t>
-      </w:r>
-    </w:p>
-    <w:p>
-      <w:pPr>
-        <w:shd w:fill="F5F5F5" w:val="clear"/>
-        <w:spacing w:line="240"/>
-        <w:ind w:left="360"/>
-      </w:pPr>
-      <w:r>
-        <w:rPr>
-          <w:rFonts w:ascii="Consolas" w:cs="Consolas" w:eastAsia="Consolas" w:hAnsi="Consolas"/>
-          <w:color w:val="2D2D2D"/>
-          <w:sz w:val="19"/>
-          <w:szCs w:val="19"/>
-        </w:rPr>
-        <w:t xml:space="preserve">│   PA12 ─── OLED_SDA ─── OLED1315 SDA (模拟 I2C)          │</w:t>
+        <w:t xml:space="preserve">│   PA11 ─── OLED_SCL ─── SSD1315 SCL (模拟 I2C)          │</w:t>
+      </w:r>
+    </w:p>
+    <w:p>
+      <w:pPr>
+        <w:shd w:fill="F5F5F5" w:val="clear"/>
+        <w:spacing w:line="240"/>
+        <w:ind w:left="360"/>
+      </w:pPr>
+      <w:r>
+        <w:rPr>
+          <w:rFonts w:ascii="Consolas" w:cs="Consolas" w:eastAsia="Consolas" w:hAnsi="Consolas"/>
+          <w:color w:val="2D2D2D"/>
+          <w:sz w:val="19"/>
+          <w:szCs w:val="19"/>
+        </w:rPr>
+        <w:t xml:space="preserve">│   PA12 ─── OLED_SDA ─── SSD1315 SDA (模拟 I2C)          │</w:t>
       </w:r>
     </w:p>
     <w:p>

</xml_diff>